<commit_message>
Update examples for recovered and torch cases
</commit_message>
<xml_diff>
--- a/examples/multivariate/doc/14-stock-close-mlp-regression.docx
+++ b/examples/multivariate/doc/14-stock-close-mlp-regression.docx
@@ -795,30 +795,6 @@
         <w:t xml:space="preserve">365</w:t>
       </w:r>
       <w:r>
-        <w:rPr>
-          <w:rStyle w:val="NormalTok"/>
-        </w:rPr>
-        <w:t xml:space="preserve"> </w:t>
-      </w:r>
-      <w:r>
-        <w:rPr>
-          <w:rStyle w:val="SpecialCharTok"/>
-        </w:rPr>
-        <w:t xml:space="preserve">*</w:t>
-      </w:r>
-      <w:r>
-        <w:rPr>
-          <w:rStyle w:val="NormalTok"/>
-        </w:rPr>
-        <w:t xml:space="preserve"> </w:t>
-      </w:r>
-      <w:r>
-        <w:rPr>
-          <w:rStyle w:val="DecValTok"/>
-        </w:rPr>
-        <w:t xml:space="preserve">2</w:t>
-      </w:r>
-      <w:r>
         <w:br/>
       </w:r>
       <w:r>
@@ -1373,7 +1349,7 @@
         <w:rPr>
           <w:rStyle w:val="DecValTok"/>
         </w:rPr>
-        <w:t xml:space="preserve">4</w:t>
+        <w:t xml:space="preserve">3</w:t>
       </w:r>
       <w:r>
         <w:rPr>
@@ -1403,6 +1379,30 @@
         <w:rPr>
           <w:rStyle w:val="NormalTok"/>
         </w:rPr>
+        <w:t xml:space="preserve">, </w:t>
+      </w:r>
+      <w:r>
+        <w:rPr>
+          <w:rStyle w:val="AttributeTok"/>
+        </w:rPr>
+        <w:t xml:space="preserve">maxit =</w:t>
+      </w:r>
+      <w:r>
+        <w:rPr>
+          <w:rStyle w:val="NormalTok"/>
+        </w:rPr>
+        <w:t xml:space="preserve"> </w:t>
+      </w:r>
+      <w:r>
+        <w:rPr>
+          <w:rStyle w:val="DecValTok"/>
+        </w:rPr>
+        <w:t xml:space="preserve">50</w:t>
+      </w:r>
+      <w:r>
+        <w:rPr>
+          <w:rStyle w:val="NormalTok"/>
+        </w:rPr>
         <w:t xml:space="preserve">),</w:t>
       </w:r>
       <w:r>
@@ -1634,7 +1634,7 @@
         <w:rPr>
           <w:rStyle w:val="DecValTok"/>
         </w:rPr>
-        <w:t xml:space="preserve">4</w:t>
+        <w:t xml:space="preserve">3</w:t>
       </w:r>
       <w:r>
         <w:rPr>
@@ -1664,6 +1664,30 @@
         <w:rPr>
           <w:rStyle w:val="NormalTok"/>
         </w:rPr>
+        <w:t xml:space="preserve">, </w:t>
+      </w:r>
+      <w:r>
+        <w:rPr>
+          <w:rStyle w:val="AttributeTok"/>
+        </w:rPr>
+        <w:t xml:space="preserve">maxit =</w:t>
+      </w:r>
+      <w:r>
+        <w:rPr>
+          <w:rStyle w:val="NormalTok"/>
+        </w:rPr>
+        <w:t xml:space="preserve"> </w:t>
+      </w:r>
+      <w:r>
+        <w:rPr>
+          <w:rStyle w:val="DecValTok"/>
+        </w:rPr>
+        <w:t xml:space="preserve">50</w:t>
+      </w:r>
+      <w:r>
+        <w:rPr>
+          <w:rStyle w:val="NormalTok"/>
+        </w:rPr>
         <w:t xml:space="preserve">),</w:t>
       </w:r>
       <w:r>
@@ -1850,7 +1874,7 @@
         <w:rPr>
           <w:rStyle w:val="DecValTok"/>
         </w:rPr>
-        <w:t xml:space="preserve">4</w:t>
+        <w:t xml:space="preserve">3</w:t>
       </w:r>
       <w:r>
         <w:rPr>
@@ -1880,6 +1904,30 @@
         <w:rPr>
           <w:rStyle w:val="NormalTok"/>
         </w:rPr>
+        <w:t xml:space="preserve">, </w:t>
+      </w:r>
+      <w:r>
+        <w:rPr>
+          <w:rStyle w:val="AttributeTok"/>
+        </w:rPr>
+        <w:t xml:space="preserve">maxit =</w:t>
+      </w:r>
+      <w:r>
+        <w:rPr>
+          <w:rStyle w:val="NormalTok"/>
+        </w:rPr>
+        <w:t xml:space="preserve"> </w:t>
+      </w:r>
+      <w:r>
+        <w:rPr>
+          <w:rStyle w:val="DecValTok"/>
+        </w:rPr>
+        <w:t xml:space="preserve">50</w:t>
+      </w:r>
+      <w:r>
+        <w:rPr>
+          <w:rStyle w:val="NormalTok"/>
+        </w:rPr>
         <w:t xml:space="preserve">),</w:t>
       </w:r>
       <w:r>
@@ -2066,7 +2114,7 @@
         <w:rPr>
           <w:rStyle w:val="DecValTok"/>
         </w:rPr>
-        <w:t xml:space="preserve">4</w:t>
+        <w:t xml:space="preserve">3</w:t>
       </w:r>
       <w:r>
         <w:rPr>
@@ -2096,6 +2144,30 @@
         <w:rPr>
           <w:rStyle w:val="NormalTok"/>
         </w:rPr>
+        <w:t xml:space="preserve">, </w:t>
+      </w:r>
+      <w:r>
+        <w:rPr>
+          <w:rStyle w:val="AttributeTok"/>
+        </w:rPr>
+        <w:t xml:space="preserve">maxit =</w:t>
+      </w:r>
+      <w:r>
+        <w:rPr>
+          <w:rStyle w:val="NormalTok"/>
+        </w:rPr>
+        <w:t xml:space="preserve"> </w:t>
+      </w:r>
+      <w:r>
+        <w:rPr>
+          <w:rStyle w:val="DecValTok"/>
+        </w:rPr>
+        <w:t xml:space="preserve">50</w:t>
+      </w:r>
+      <w:r>
+        <w:rPr>
+          <w:rStyle w:val="NormalTok"/>
+        </w:rPr>
         <w:t xml:space="preserve">),</w:t>
       </w:r>
       <w:r>
@@ -2282,7 +2354,7 @@
         <w:rPr>
           <w:rStyle w:val="DecValTok"/>
         </w:rPr>
-        <w:t xml:space="preserve">4</w:t>
+        <w:t xml:space="preserve">3</w:t>
       </w:r>
       <w:r>
         <w:rPr>
@@ -2307,6 +2379,30 @@
           <w:rStyle w:val="DecValTok"/>
         </w:rPr>
         <w:t xml:space="preserve">0</w:t>
+      </w:r>
+      <w:r>
+        <w:rPr>
+          <w:rStyle w:val="NormalTok"/>
+        </w:rPr>
+        <w:t xml:space="preserve">, </w:t>
+      </w:r>
+      <w:r>
+        <w:rPr>
+          <w:rStyle w:val="AttributeTok"/>
+        </w:rPr>
+        <w:t xml:space="preserve">maxit =</w:t>
+      </w:r>
+      <w:r>
+        <w:rPr>
+          <w:rStyle w:val="NormalTok"/>
+        </w:rPr>
+        <w:t xml:space="preserve"> </w:t>
+      </w:r>
+      <w:r>
+        <w:rPr>
+          <w:rStyle w:val="DecValTok"/>
+        </w:rPr>
+        <w:t xml:space="preserve">50</w:t>
       </w:r>
       <w:r>
         <w:rPr>
@@ -2574,7 +2670,7 @@
         <w:rPr>
           <w:rStyle w:val="VerbatimChar"/>
         </w:rPr>
-        <w:t xml:space="preserve">## [1] 72.69532</w:t>
+        <w:t xml:space="preserve">## [1] 85.71934</w:t>
       </w:r>
       <w:r>
         <w:br/>
@@ -2673,7 +2769,7 @@
         <w:rPr>
           <w:rStyle w:val="VerbatimChar"/>
         </w:rPr>
-        <w:t xml:space="preserve">## [1] 85.05918</w:t>
+        <w:t xml:space="preserve">## [1] 86.00116</w:t>
       </w:r>
       <w:r>
         <w:br/>
@@ -2700,7 +2796,7 @@
         <w:rPr>
           <w:rStyle w:val="VerbatimChar"/>
         </w:rPr>
-        <w:t xml:space="preserve">## [1] 85.29949</w:t>
+        <w:t xml:space="preserve">## [1] 87.49194</w:t>
       </w:r>
       <w:r>
         <w:br/>
@@ -2727,7 +2823,7 @@
         <w:rPr>
           <w:rStyle w:val="VerbatimChar"/>
         </w:rPr>
-        <w:t xml:space="preserve">## [1] 81.44817</w:t>
+        <w:t xml:space="preserve">## [1] 85.52673</w:t>
       </w:r>
       <w:r>
         <w:br/>
@@ -2754,7 +2850,7 @@
         <w:rPr>
           <w:rStyle w:val="VerbatimChar"/>
         </w:rPr>
-        <w:t xml:space="preserve">## [1] 21877063</w:t>
+        <w:t xml:space="preserve">## [1] 23156233</w:t>
       </w:r>
       <w:r>
         <w:br/>
@@ -2790,7 +2886,7 @@
         <w:rPr>
           <w:rStyle w:val="VerbatimChar"/>
         </w:rPr>
-        <w:t xml:space="preserve">## 1 72.69532 85.05918 85.29949 81.44817 21877063</w:t>
+        <w:t xml:space="preserve">## 1 85.71934 86.00116 87.49194 85.52673 23156233</w:t>
       </w:r>
       <w:r>
         <w:br/>
@@ -2887,7 +2983,7 @@
         <w:rPr>
           <w:rStyle w:val="VerbatimChar"/>
         </w:rPr>
-        <w:t xml:space="preserve">## [1]  72.69532  32.90832  70.70014 188.45650  51.03202</w:t>
+        <w:t xml:space="preserve">## [1] 85.71934 86.72840 86.81184 86.14814 86.02339</w:t>
       </w:r>
       <w:r>
         <w:br/>
@@ -2986,7 +3082,7 @@
         <w:rPr>
           <w:rStyle w:val="VerbatimChar"/>
         </w:rPr>
-        <w:t xml:space="preserve">## [1]  85.05918  38.60900 -73.25965  73.60015  51.60219</w:t>
+        <w:t xml:space="preserve">## [1] 86.00116 85.19367 85.60119 86.40139 85.80143</w:t>
       </w:r>
       <w:r>
         <w:br/>
@@ -3013,7 +3109,7 @@
         <w:rPr>
           <w:rStyle w:val="VerbatimChar"/>
         </w:rPr>
-        <w:t xml:space="preserve">## [1]   85.2994888   72.5576631   50.9842936 -142.8079115   -0.8722029</w:t>
+        <w:t xml:space="preserve">## [1] 87.49194 88.53915 88.59214 88.13705 87.80729</w:t>
       </w:r>
       <w:r>
         <w:br/>
@@ -3040,7 +3136,7 @@
         <w:rPr>
           <w:rStyle w:val="VerbatimChar"/>
         </w:rPr>
-        <w:t xml:space="preserve">## [1]  81.44817  73.67211 -91.78459 200.51619 -26.27833</w:t>
+        <w:t xml:space="preserve">## [1] 85.52673 85.92770 85.33525 85.90062 85.78070</w:t>
       </w:r>
       <w:r>
         <w:br/>
@@ -3067,7 +3163,7 @@
         <w:rPr>
           <w:rStyle w:val="VerbatimChar"/>
         </w:rPr>
-        <w:t xml:space="preserve">## [1] 21877063 25529676 29695572 25579320 28693895</w:t>
+        <w:t xml:space="preserve">## [1] 23156233 29050471 27906794 26263887 24386466</w:t>
       </w:r>
       <w:r>
         <w:br/>
@@ -3094,52 +3190,52 @@
         <w:rPr>
           <w:rStyle w:val="VerbatimChar"/>
         </w:rPr>
-        <w:t xml:space="preserve">##       close      open         high       low   volume</w:t>
-      </w:r>
-      <w:r>
-        <w:br/>
-      </w:r>
-      <w:r>
-        <w:rPr>
-          <w:rStyle w:val="VerbatimChar"/>
-        </w:rPr>
-        <w:t xml:space="preserve">## 1  72.69532  85.05918   85.2994888  81.44817 21877063</w:t>
-      </w:r>
-      <w:r>
-        <w:br/>
-      </w:r>
-      <w:r>
-        <w:rPr>
-          <w:rStyle w:val="VerbatimChar"/>
-        </w:rPr>
-        <w:t xml:space="preserve">## 2  32.90832  38.60900   72.5576631  73.67211 25529676</w:t>
-      </w:r>
-      <w:r>
-        <w:br/>
-      </w:r>
-      <w:r>
-        <w:rPr>
-          <w:rStyle w:val="VerbatimChar"/>
-        </w:rPr>
-        <w:t xml:space="preserve">## 3  70.70014 -73.25965   50.9842936 -91.78459 29695572</w:t>
-      </w:r>
-      <w:r>
-        <w:br/>
-      </w:r>
-      <w:r>
-        <w:rPr>
-          <w:rStyle w:val="VerbatimChar"/>
-        </w:rPr>
-        <w:t xml:space="preserve">## 4 188.45650  73.60015 -142.8079115 200.51619 25579320</w:t>
-      </w:r>
-      <w:r>
-        <w:br/>
-      </w:r>
-      <w:r>
-        <w:rPr>
-          <w:rStyle w:val="VerbatimChar"/>
-        </w:rPr>
-        <w:t xml:space="preserve">## 5  51.03202  51.60219   -0.8722029 -26.27833 28693895</w:t>
+        <w:t xml:space="preserve">##      close     open     high      low   volume</w:t>
+      </w:r>
+      <w:r>
+        <w:br/>
+      </w:r>
+      <w:r>
+        <w:rPr>
+          <w:rStyle w:val="VerbatimChar"/>
+        </w:rPr>
+        <w:t xml:space="preserve">## 1 85.71934 86.00116 87.49194 85.52673 23156233</w:t>
+      </w:r>
+      <w:r>
+        <w:br/>
+      </w:r>
+      <w:r>
+        <w:rPr>
+          <w:rStyle w:val="VerbatimChar"/>
+        </w:rPr>
+        <w:t xml:space="preserve">## 2 86.72840 85.19367 88.53915 85.92770 29050471</w:t>
+      </w:r>
+      <w:r>
+        <w:br/>
+      </w:r>
+      <w:r>
+        <w:rPr>
+          <w:rStyle w:val="VerbatimChar"/>
+        </w:rPr>
+        <w:t xml:space="preserve">## 3 86.81184 85.60119 88.59214 85.33525 27906794</w:t>
+      </w:r>
+      <w:r>
+        <w:br/>
+      </w:r>
+      <w:r>
+        <w:rPr>
+          <w:rStyle w:val="VerbatimChar"/>
+        </w:rPr>
+        <w:t xml:space="preserve">## 4 86.14814 86.40139 88.13705 85.90062 26263887</w:t>
+      </w:r>
+      <w:r>
+        <w:br/>
+      </w:r>
+      <w:r>
+        <w:rPr>
+          <w:rStyle w:val="VerbatimChar"/>
+        </w:rPr>
+        <w:t xml:space="preserve">## 5 86.02339 85.80143 87.80729 85.78070 24386466</w:t>
       </w:r>
       <w:r>
         <w:br/>
@@ -3197,52 +3293,52 @@
         <w:rPr>
           <w:rStyle w:val="VerbatimChar"/>
         </w:rPr>
-        <w:t xml:space="preserve">##       close      open         high       low   volume</w:t>
-      </w:r>
-      <w:r>
-        <w:br/>
-      </w:r>
-      <w:r>
-        <w:rPr>
-          <w:rStyle w:val="VerbatimChar"/>
-        </w:rPr>
-        <w:t xml:space="preserve">## 1  72.69532  85.05918   85.2994888  81.44817 21877063</w:t>
-      </w:r>
-      <w:r>
-        <w:br/>
-      </w:r>
-      <w:r>
-        <w:rPr>
-          <w:rStyle w:val="VerbatimChar"/>
-        </w:rPr>
-        <w:t xml:space="preserve">## 2  32.90832  38.60900   72.5576631  73.67211 25529676</w:t>
-      </w:r>
-      <w:r>
-        <w:br/>
-      </w:r>
-      <w:r>
-        <w:rPr>
-          <w:rStyle w:val="VerbatimChar"/>
-        </w:rPr>
-        <w:t xml:space="preserve">## 3  70.70014 -73.25965   50.9842936 -91.78459 29695572</w:t>
-      </w:r>
-      <w:r>
-        <w:br/>
-      </w:r>
-      <w:r>
-        <w:rPr>
-          <w:rStyle w:val="VerbatimChar"/>
-        </w:rPr>
-        <w:t xml:space="preserve">## 4 188.45650  73.60015 -142.8079115 200.51619 25579320</w:t>
-      </w:r>
-      <w:r>
-        <w:br/>
-      </w:r>
-      <w:r>
-        <w:rPr>
-          <w:rStyle w:val="VerbatimChar"/>
-        </w:rPr>
-        <w:t xml:space="preserve">## 5  51.03202  51.60219   -0.8722029 -26.27833 28693895</w:t>
+        <w:t xml:space="preserve">##      close     open     high      low   volume</w:t>
+      </w:r>
+      <w:r>
+        <w:br/>
+      </w:r>
+      <w:r>
+        <w:rPr>
+          <w:rStyle w:val="VerbatimChar"/>
+        </w:rPr>
+        <w:t xml:space="preserve">## 1 85.71934 86.00116 87.49194 85.52673 23156233</w:t>
+      </w:r>
+      <w:r>
+        <w:br/>
+      </w:r>
+      <w:r>
+        <w:rPr>
+          <w:rStyle w:val="VerbatimChar"/>
+        </w:rPr>
+        <w:t xml:space="preserve">## 2 86.72840 85.19367 88.53915 85.92770 29050471</w:t>
+      </w:r>
+      <w:r>
+        <w:br/>
+      </w:r>
+      <w:r>
+        <w:rPr>
+          <w:rStyle w:val="VerbatimChar"/>
+        </w:rPr>
+        <w:t xml:space="preserve">## 3 86.81184 85.60119 88.59214 85.33525 27906794</w:t>
+      </w:r>
+      <w:r>
+        <w:br/>
+      </w:r>
+      <w:r>
+        <w:rPr>
+          <w:rStyle w:val="VerbatimChar"/>
+        </w:rPr>
+        <w:t xml:space="preserve">## 4 86.14814 86.40139 88.13705 85.90062 26263887</w:t>
+      </w:r>
+      <w:r>
+        <w:br/>
+      </w:r>
+      <w:r>
+        <w:rPr>
+          <w:rStyle w:val="VerbatimChar"/>
+        </w:rPr>
+        <w:t xml:space="preserve">## 5 86.02339 85.80143 87.80729 85.78070 24386466</w:t>
       </w:r>
     </w:p>
     <w:p>
@@ -3309,16 +3405,16 @@
         <w:rPr>
           <w:rStyle w:val="VerbatimChar"/>
         </w:rPr>
-        <w:t xml:space="preserve">##        mse     smape       R2</w:t>
-      </w:r>
-      <w:r>
-        <w:br/>
-      </w:r>
-      <w:r>
-        <w:rPr>
-          <w:rStyle w:val="VerbatimChar"/>
-        </w:rPr>
-        <w:t xml:space="preserve">## 1 3119.531 0.5201632 -1475.87</w:t>
+        <w:t xml:space="preserve">##        mse      smape        R2</w:t>
+      </w:r>
+      <w:r>
+        <w:br/>
+      </w:r>
+      <w:r>
+        <w:rPr>
+          <w:rStyle w:val="VerbatimChar"/>
+        </w:rPr>
+        <w:t xml:space="preserve">## 1 4.010121 0.01863371 -0.898499</w:t>
       </w:r>
     </w:p>
     <w:p>
@@ -3400,7 +3496,7 @@
               <a:graphicData uri="http://schemas.openxmlformats.org/drawingml/2006/picture">
                 <pic:pic>
                   <pic:nvPicPr>
-                    <pic:cNvPr descr="C:\Git\dal\tspredit\examples\multivariate\doc\14-stock-close-mlp-regression_files/3c31e281d539ee516f4a2b350a281a51e6e1f2c4.png" id="11" name="Picture"/>
+                    <pic:cNvPr descr="C:\Git\dal\tspredit\examples\multivariate\doc\14-stock-close-mlp-regression_files/0759b814596ff68068cb84638c29bac41dfba78e.png" id="11" name="Picture"/>
                     <pic:cNvPicPr>
                       <a:picLocks noChangeArrowheads="1" noChangeAspect="1"/>
                     </pic:cNvPicPr>

</xml_diff>